<commit_message>
Add consolidated address list and two shortlist corrections
Lists every supplier address that could be verified, the ones that need
a phone call first, and the exact contact-page URLs where the network
filter blocked verification, rather than guessing addresses.

Two corrections to the shortlist: Ovation Egypt is represented by Emeco
Travel at the same Cairo address, so writing to both is writing to one
company twice, leaving three ground partners; and Kemet Dahabiya takes
up to 19 guests on full charter, which fits the cabin requirement though
the night-sailing limit still applies.

Co-Authored-By: Claude Opus 5 <noreply@anthropic.com>
Claude-Session: https://claude.ai/code/session_01KQFm1d6HbwvN6nT4uerjN3
</commit_message>
<xml_diff>
--- a/egypt-jan-2027/Подрядчики_кандидаты_и_проверка.docx
+++ b/egypt-jan-2027/Подрядчики_кандидаты_и_проверка.docx
@@ -1799,6 +1799,1481 @@
         <w:t xml:space="preserve"> Берите по тому, кто прислал документы, а не обещания.</w:t>
       </w:r>
     </w:p>
+    <w:p>
+      <w:pPr>
+        <w:pBdr>
+          <w:bottom w:val="single" w:sz="6" w:space="1" w:color="BFBFBF"/>
+        </w:pBdr>
+        <w:spacing w:after="200"/>
+      </w:pPr>
+    </w:p>
+    <w:p>
+      <w:pPr>
+        <w:spacing w:before="320" w:after="120"/>
+      </w:pPr>
+      <w:r>
+        <w:rPr>
+          <w:b/>
+          <w:color w:val="1F3864"/>
+          <w:sz w:val="29"/>
+        </w:rPr>
+        <w:t>7. ИТОГОВЫЙ СПИСОК АДРЕСОВ</w:t>
+      </w:r>
+    </w:p>
+    <w:p>
+      <w:r>
+        <w:rPr>
+          <w:b/>
+        </w:rPr>
+        <w:t>Почему часть адресов это формы, а не почта.</w:t>
+      </w:r>
+      <w:r>
+        <w:t xml:space="preserve"> Сетевой фильтр нашей среды блокирует большинство сайтов поставщиков, поэтому проверить их страницы Contact напрямую невозможно. Там, где адрес не подтверждён, я даю точный URL страницы контактов, а не угаданный адрес.</w:t>
+      </w:r>
+    </w:p>
+    <w:p>
+      <w:pPr>
+        <w:spacing w:before="240" w:after="80"/>
+      </w:pPr>
+      <w:r>
+        <w:rPr>
+          <w:b/>
+          <w:color w:val="1F3864"/>
+          <w:sz w:val="24"/>
+        </w:rPr>
+        <w:t>Готово к отправке прямо сейчас</w:t>
+      </w:r>
+    </w:p>
+    <w:tbl>
+      <w:tblPr>
+        <w:tblStyle w:val="TableGrid"/>
+        <w:tblW w:type="auto" w:w="0"/>
+        <w:jc w:val="center"/>
+        <w:tblLook w:firstColumn="1" w:firstRow="1" w:lastColumn="0" w:lastRow="0" w:noHBand="0" w:noVBand="1" w:val="04A0"/>
+      </w:tblPr>
+      <w:tblGrid>
+        <w:gridCol w:w="3286"/>
+        <w:gridCol w:w="3286"/>
+        <w:gridCol w:w="3286"/>
+      </w:tblGrid>
+      <w:tr>
+        <w:tc>
+          <w:tcPr>
+            <w:tcW w:type="dxa" w:w="3286"/>
+            <w:shd w:val="clear" w:fill="1F3864"/>
+          </w:tcPr>
+          <w:p>
+            <w:pPr>
+              <w:spacing w:after="40"/>
+            </w:pPr>
+            <w:r>
+              <w:rPr>
+                <w:b/>
+                <w:color w:val="FFFFFF"/>
+                <w:sz w:val="19"/>
+              </w:rPr>
+            </w:r>
+            <w:r>
+              <w:rPr>
+                <w:b/>
+                <w:color w:val="FFFFFF"/>
+                <w:sz w:val="19"/>
+              </w:rPr>
+              <w:t>Кому</w:t>
+            </w:r>
+          </w:p>
+        </w:tc>
+        <w:tc>
+          <w:tcPr>
+            <w:tcW w:type="dxa" w:w="3286"/>
+            <w:shd w:val="clear" w:fill="1F3864"/>
+          </w:tcPr>
+          <w:p>
+            <w:pPr>
+              <w:spacing w:after="40"/>
+            </w:pPr>
+            <w:r>
+              <w:rPr>
+                <w:b/>
+                <w:color w:val="FFFFFF"/>
+                <w:sz w:val="19"/>
+              </w:rPr>
+            </w:r>
+            <w:r>
+              <w:rPr>
+                <w:b/>
+                <w:color w:val="FFFFFF"/>
+                <w:sz w:val="19"/>
+              </w:rPr>
+              <w:t>Адрес</w:t>
+            </w:r>
+          </w:p>
+        </w:tc>
+        <w:tc>
+          <w:tcPr>
+            <w:tcW w:type="dxa" w:w="3286"/>
+            <w:shd w:val="clear" w:fill="1F3864"/>
+          </w:tcPr>
+          <w:p>
+            <w:pPr>
+              <w:spacing w:after="40"/>
+            </w:pPr>
+            <w:r>
+              <w:rPr>
+                <w:b/>
+                <w:color w:val="FFFFFF"/>
+                <w:sz w:val="19"/>
+              </w:rPr>
+            </w:r>
+            <w:r>
+              <w:rPr>
+                <w:b/>
+                <w:color w:val="FFFFFF"/>
+                <w:sz w:val="19"/>
+              </w:rPr>
+              <w:t>Письмо</w:t>
+            </w:r>
+          </w:p>
+        </w:tc>
+      </w:tr>
+      <w:tr>
+        <w:tc>
+          <w:tcPr>
+            <w:tcW w:type="dxa" w:w="3286"/>
+          </w:tcPr>
+          <w:p>
+            <w:pPr>
+              <w:spacing w:after="40"/>
+            </w:pPr>
+            <w:r>
+              <w:rPr>
+                <w:sz w:val="19"/>
+              </w:rPr>
+            </w:r>
+            <w:r>
+              <w:rPr>
+                <w:sz w:val="19"/>
+              </w:rPr>
+              <w:t>Oberoi, борта Philae и Zahra</w:t>
+            </w:r>
+          </w:p>
+        </w:tc>
+        <w:tc>
+          <w:tcPr>
+            <w:tcW w:type="dxa" w:w="3286"/>
+          </w:tcPr>
+          <w:p>
+            <w:pPr>
+              <w:spacing w:after="40"/>
+            </w:pPr>
+            <w:r>
+              <w:rPr>
+                <w:sz w:val="19"/>
+              </w:rPr>
+            </w:r>
+            <w:r>
+              <w:rPr>
+                <w:rFonts w:ascii="Consolas" w:hAnsi="Consolas"/>
+                <w:sz w:val="19"/>
+              </w:rPr>
+              <w:t>reservations@oberoigroup.com</w:t>
+            </w:r>
+          </w:p>
+        </w:tc>
+        <w:tc>
+          <w:tcPr>
+            <w:tcW w:type="dxa" w:w="3286"/>
+          </w:tcPr>
+          <w:p>
+            <w:pPr>
+              <w:spacing w:after="40"/>
+            </w:pPr>
+            <w:r>
+              <w:rPr>
+                <w:sz w:val="19"/>
+              </w:rPr>
+            </w:r>
+            <w:r>
+              <w:rPr>
+                <w:sz w:val="19"/>
+              </w:rPr>
+              <w:t>01</w:t>
+            </w:r>
+          </w:p>
+        </w:tc>
+      </w:tr>
+      <w:tr>
+        <w:tc>
+          <w:tcPr>
+            <w:tcW w:type="dxa" w:w="3286"/>
+            <w:shd w:val="clear" w:fill="F2F5FA"/>
+          </w:tcPr>
+          <w:p>
+            <w:pPr>
+              <w:spacing w:after="40"/>
+            </w:pPr>
+            <w:r>
+              <w:rPr>
+                <w:sz w:val="19"/>
+              </w:rPr>
+            </w:r>
+            <w:r>
+              <w:rPr>
+                <w:b/>
+                <w:sz w:val="19"/>
+              </w:rPr>
+              <w:t>Emeco Travel</w:t>
+            </w:r>
+          </w:p>
+        </w:tc>
+        <w:tc>
+          <w:tcPr>
+            <w:tcW w:type="dxa" w:w="3286"/>
+            <w:shd w:val="clear" w:fill="F2F5FA"/>
+          </w:tcPr>
+          <w:p>
+            <w:pPr>
+              <w:spacing w:after="40"/>
+            </w:pPr>
+            <w:r>
+              <w:rPr>
+                <w:sz w:val="19"/>
+              </w:rPr>
+            </w:r>
+            <w:r>
+              <w:rPr>
+                <w:rFonts w:ascii="Consolas" w:hAnsi="Consolas"/>
+                <w:sz w:val="19"/>
+              </w:rPr>
+              <w:t>management@emeco.com</w:t>
+            </w:r>
+            <w:r>
+              <w:rPr>
+                <w:sz w:val="19"/>
+              </w:rPr>
+              <w:t>, +202 2577 8768, +202 2576 4101</w:t>
+            </w:r>
+          </w:p>
+        </w:tc>
+        <w:tc>
+          <w:tcPr>
+            <w:tcW w:type="dxa" w:w="3286"/>
+            <w:shd w:val="clear" w:fill="F2F5FA"/>
+          </w:tcPr>
+          <w:p>
+            <w:pPr>
+              <w:spacing w:after="40"/>
+            </w:pPr>
+            <w:r>
+              <w:rPr>
+                <w:sz w:val="19"/>
+              </w:rPr>
+            </w:r>
+            <w:r>
+              <w:rPr>
+                <w:sz w:val="19"/>
+              </w:rPr>
+              <w:t>02</w:t>
+            </w:r>
+          </w:p>
+        </w:tc>
+      </w:tr>
+      <w:tr>
+        <w:tc>
+          <w:tcPr>
+            <w:tcW w:type="dxa" w:w="3286"/>
+          </w:tcPr>
+          <w:p>
+            <w:pPr>
+              <w:spacing w:after="40"/>
+            </w:pPr>
+            <w:r>
+              <w:rPr>
+                <w:sz w:val="19"/>
+              </w:rPr>
+            </w:r>
+            <w:r>
+              <w:rPr>
+                <w:sz w:val="19"/>
+              </w:rPr>
+              <w:t>Marriott Mena House, номера</w:t>
+            </w:r>
+          </w:p>
+        </w:tc>
+        <w:tc>
+          <w:tcPr>
+            <w:tcW w:type="dxa" w:w="3286"/>
+          </w:tcPr>
+          <w:p>
+            <w:pPr>
+              <w:spacing w:after="40"/>
+            </w:pPr>
+            <w:r>
+              <w:rPr>
+                <w:sz w:val="19"/>
+              </w:rPr>
+            </w:r>
+            <w:r>
+              <w:rPr>
+                <w:rFonts w:ascii="Consolas" w:hAnsi="Consolas"/>
+                <w:sz w:val="19"/>
+              </w:rPr>
+              <w:t>mhrs.caimn.reservations@marriott.com</w:t>
+            </w:r>
+            <w:r>
+              <w:rPr>
+                <w:sz w:val="19"/>
+              </w:rPr>
+              <w:t xml:space="preserve">, копия </w:t>
+            </w:r>
+            <w:r>
+              <w:rPr>
+                <w:rFonts w:ascii="Consolas" w:hAnsi="Consolas"/>
+                <w:sz w:val="19"/>
+              </w:rPr>
+              <w:t>mhrs.caimn.guestrelations@marriott.com</w:t>
+            </w:r>
+          </w:p>
+        </w:tc>
+        <w:tc>
+          <w:tcPr>
+            <w:tcW w:type="dxa" w:w="3286"/>
+          </w:tcPr>
+          <w:p>
+            <w:pPr>
+              <w:spacing w:after="40"/>
+            </w:pPr>
+            <w:r>
+              <w:rPr>
+                <w:sz w:val="19"/>
+              </w:rPr>
+            </w:r>
+            <w:r>
+              <w:rPr>
+                <w:sz w:val="19"/>
+              </w:rPr>
+              <w:t>06</w:t>
+            </w:r>
+          </w:p>
+        </w:tc>
+      </w:tr>
+      <w:tr>
+        <w:tc>
+          <w:tcPr>
+            <w:tcW w:type="dxa" w:w="3286"/>
+            <w:shd w:val="clear" w:fill="F2F5FA"/>
+          </w:tcPr>
+          <w:p>
+            <w:pPr>
+              <w:spacing w:after="40"/>
+            </w:pPr>
+            <w:r>
+              <w:rPr>
+                <w:sz w:val="19"/>
+              </w:rPr>
+            </w:r>
+            <w:r>
+              <w:rPr>
+                <w:sz w:val="19"/>
+              </w:rPr>
+              <w:t>Marriott Mena House, ужин</w:t>
+            </w:r>
+          </w:p>
+        </w:tc>
+        <w:tc>
+          <w:tcPr>
+            <w:tcW w:type="dxa" w:w="3286"/>
+            <w:shd w:val="clear" w:fill="F2F5FA"/>
+          </w:tcPr>
+          <w:p>
+            <w:pPr>
+              <w:spacing w:after="40"/>
+            </w:pPr>
+            <w:r>
+              <w:rPr>
+                <w:sz w:val="19"/>
+              </w:rPr>
+            </w:r>
+            <w:r>
+              <w:rPr>
+                <w:rFonts w:ascii="Consolas" w:hAnsi="Consolas"/>
+                <w:sz w:val="19"/>
+              </w:rPr>
+              <w:t>mhrs.caimn.ebc@marriott.com</w:t>
+            </w:r>
+            <w:r>
+              <w:rPr>
+                <w:sz w:val="19"/>
+              </w:rPr>
+              <w:t xml:space="preserve">, </w:t>
+            </w:r>
+            <w:r>
+              <w:rPr>
+                <w:rFonts w:ascii="Consolas" w:hAnsi="Consolas"/>
+                <w:sz w:val="19"/>
+              </w:rPr>
+              <w:t>events.menahouse@marriott.com</w:t>
+            </w:r>
+            <w:r>
+              <w:rPr>
+                <w:sz w:val="19"/>
+              </w:rPr>
+              <w:t>, WhatsApp +20 103 303 0825</w:t>
+            </w:r>
+          </w:p>
+        </w:tc>
+        <w:tc>
+          <w:tcPr>
+            <w:tcW w:type="dxa" w:w="3286"/>
+            <w:shd w:val="clear" w:fill="F2F5FA"/>
+          </w:tcPr>
+          <w:p>
+            <w:pPr>
+              <w:spacing w:after="40"/>
+            </w:pPr>
+            <w:r>
+              <w:rPr>
+                <w:sz w:val="19"/>
+              </w:rPr>
+            </w:r>
+            <w:r>
+              <w:rPr>
+                <w:sz w:val="19"/>
+              </w:rPr>
+              <w:t>06</w:t>
+            </w:r>
+          </w:p>
+        </w:tc>
+      </w:tr>
+      <w:tr>
+        <w:tc>
+          <w:tcPr>
+            <w:tcW w:type="dxa" w:w="3286"/>
+          </w:tcPr>
+          <w:p>
+            <w:pPr>
+              <w:spacing w:after="40"/>
+            </w:pPr>
+            <w:r>
+              <w:rPr>
+                <w:sz w:val="19"/>
+              </w:rPr>
+            </w:r>
+            <w:r>
+              <w:rPr>
+                <w:sz w:val="19"/>
+              </w:rPr>
+              <w:t>Mövenpick Resort Aswan</w:t>
+            </w:r>
+          </w:p>
+        </w:tc>
+        <w:tc>
+          <w:tcPr>
+            <w:tcW w:type="dxa" w:w="3286"/>
+          </w:tcPr>
+          <w:p>
+            <w:pPr>
+              <w:spacing w:after="40"/>
+            </w:pPr>
+            <w:r>
+              <w:rPr>
+                <w:sz w:val="19"/>
+              </w:rPr>
+            </w:r>
+            <w:r>
+              <w:rPr>
+                <w:rFonts w:ascii="Consolas" w:hAnsi="Consolas"/>
+                <w:sz w:val="19"/>
+              </w:rPr>
+              <w:t>resort.aswan@movenpick.com</w:t>
+            </w:r>
+            <w:r>
+              <w:rPr>
+                <w:sz w:val="19"/>
+              </w:rPr>
+              <w:t>, +20 97 245 4455</w:t>
+            </w:r>
+          </w:p>
+        </w:tc>
+        <w:tc>
+          <w:tcPr>
+            <w:tcW w:type="dxa" w:w="3286"/>
+          </w:tcPr>
+          <w:p>
+            <w:pPr>
+              <w:spacing w:after="40"/>
+            </w:pPr>
+            <w:r>
+              <w:rPr>
+                <w:sz w:val="19"/>
+              </w:rPr>
+            </w:r>
+            <w:r>
+              <w:rPr>
+                <w:sz w:val="19"/>
+              </w:rPr>
+              <w:t>08</w:t>
+            </w:r>
+          </w:p>
+        </w:tc>
+      </w:tr>
+      <w:tr>
+        <w:tc>
+          <w:tcPr>
+            <w:tcW w:type="dxa" w:w="3286"/>
+            <w:shd w:val="clear" w:fill="F2F5FA"/>
+          </w:tcPr>
+          <w:p>
+            <w:pPr>
+              <w:spacing w:after="40"/>
+            </w:pPr>
+            <w:r>
+              <w:rPr>
+                <w:sz w:val="19"/>
+              </w:rPr>
+            </w:r>
+            <w:r>
+              <w:rPr>
+                <w:b/>
+                <w:sz w:val="19"/>
+              </w:rPr>
+              <w:t>Mara House Luxor</w:t>
+            </w:r>
+            <w:r>
+              <w:rPr>
+                <w:sz w:val="19"/>
+              </w:rPr>
+              <w:t>, трек спецдоступов</w:t>
+            </w:r>
+          </w:p>
+        </w:tc>
+        <w:tc>
+          <w:tcPr>
+            <w:tcW w:type="dxa" w:w="3286"/>
+            <w:shd w:val="clear" w:fill="F2F5FA"/>
+          </w:tcPr>
+          <w:p>
+            <w:pPr>
+              <w:spacing w:after="40"/>
+            </w:pPr>
+            <w:r>
+              <w:rPr>
+                <w:sz w:val="19"/>
+              </w:rPr>
+            </w:r>
+            <w:r>
+              <w:rPr>
+                <w:rFonts w:ascii="Consolas" w:hAnsi="Consolas"/>
+                <w:sz w:val="19"/>
+              </w:rPr>
+              <w:t>maraegypt@gmail.com</w:t>
+            </w:r>
+          </w:p>
+        </w:tc>
+        <w:tc>
+          <w:tcPr>
+            <w:tcW w:type="dxa" w:w="3286"/>
+            <w:shd w:val="clear" w:fill="F2F5FA"/>
+          </w:tcPr>
+          <w:p>
+            <w:pPr>
+              <w:spacing w:after="40"/>
+            </w:pPr>
+            <w:r>
+              <w:rPr>
+                <w:sz w:val="19"/>
+              </w:rPr>
+            </w:r>
+            <w:r>
+              <w:rPr>
+                <w:sz w:val="19"/>
+              </w:rPr>
+              <w:t>03</w:t>
+            </w:r>
+          </w:p>
+        </w:tc>
+      </w:tr>
+      <w:tr>
+        <w:tc>
+          <w:tcPr>
+            <w:tcW w:type="dxa" w:w="3286"/>
+          </w:tcPr>
+          <w:p>
+            <w:pPr>
+              <w:spacing w:after="40"/>
+            </w:pPr>
+            <w:r>
+              <w:rPr>
+                <w:sz w:val="19"/>
+              </w:rPr>
+            </w:r>
+            <w:r>
+              <w:rPr>
+                <w:sz w:val="19"/>
+              </w:rPr>
+              <w:t>EgyptAir, группы</w:t>
+            </w:r>
+          </w:p>
+        </w:tc>
+        <w:tc>
+          <w:tcPr>
+            <w:tcW w:type="dxa" w:w="3286"/>
+          </w:tcPr>
+          <w:p>
+            <w:pPr>
+              <w:spacing w:after="40"/>
+            </w:pPr>
+            <w:r>
+              <w:rPr>
+                <w:sz w:val="19"/>
+              </w:rPr>
+            </w:r>
+            <w:r>
+              <w:rPr>
+                <w:sz w:val="19"/>
+              </w:rPr>
+              <w:t>форма egyptair.com/en/Book/Pages/Group-Reservation.aspx</w:t>
+            </w:r>
+          </w:p>
+        </w:tc>
+        <w:tc>
+          <w:tcPr>
+            <w:tcW w:type="dxa" w:w="3286"/>
+          </w:tcPr>
+          <w:p>
+            <w:pPr>
+              <w:spacing w:after="40"/>
+            </w:pPr>
+            <w:r>
+              <w:rPr>
+                <w:sz w:val="19"/>
+              </w:rPr>
+            </w:r>
+            <w:r>
+              <w:rPr>
+                <w:sz w:val="19"/>
+              </w:rPr>
+              <w:t>10</w:t>
+            </w:r>
+          </w:p>
+        </w:tc>
+      </w:tr>
+    </w:tbl>
+    <w:p>
+      <w:pPr>
+        <w:spacing w:after="80"/>
+      </w:pPr>
+    </w:p>
+    <w:p>
+      <w:pPr>
+        <w:spacing w:before="240" w:after="80"/>
+      </w:pPr>
+      <w:r>
+        <w:rPr>
+          <w:b/>
+          <w:color w:val="1F3864"/>
+          <w:sz w:val="24"/>
+        </w:rPr>
+        <w:t>Сначала звонок, адрес получаем в разговоре</w:t>
+      </w:r>
+    </w:p>
+    <w:tbl>
+      <w:tblPr>
+        <w:tblStyle w:val="TableGrid"/>
+        <w:tblW w:type="auto" w:w="0"/>
+        <w:jc w:val="center"/>
+        <w:tblLook w:firstColumn="1" w:firstRow="1" w:lastColumn="0" w:lastRow="0" w:noHBand="0" w:noVBand="1" w:val="04A0"/>
+      </w:tblPr>
+      <w:tblGrid>
+        <w:gridCol w:w="3286"/>
+        <w:gridCol w:w="3286"/>
+        <w:gridCol w:w="3286"/>
+      </w:tblGrid>
+      <w:tr>
+        <w:tc>
+          <w:tcPr>
+            <w:tcW w:type="dxa" w:w="3286"/>
+            <w:shd w:val="clear" w:fill="1F3864"/>
+          </w:tcPr>
+          <w:p>
+            <w:pPr>
+              <w:spacing w:after="40"/>
+            </w:pPr>
+            <w:r>
+              <w:rPr>
+                <w:b/>
+                <w:color w:val="FFFFFF"/>
+                <w:sz w:val="19"/>
+              </w:rPr>
+            </w:r>
+            <w:r>
+              <w:rPr>
+                <w:b/>
+                <w:color w:val="FFFFFF"/>
+                <w:sz w:val="19"/>
+              </w:rPr>
+              <w:t>Кому</w:t>
+            </w:r>
+          </w:p>
+        </w:tc>
+        <w:tc>
+          <w:tcPr>
+            <w:tcW w:type="dxa" w:w="3286"/>
+            <w:shd w:val="clear" w:fill="1F3864"/>
+          </w:tcPr>
+          <w:p>
+            <w:pPr>
+              <w:spacing w:after="40"/>
+            </w:pPr>
+            <w:r>
+              <w:rPr>
+                <w:b/>
+                <w:color w:val="FFFFFF"/>
+                <w:sz w:val="19"/>
+              </w:rPr>
+            </w:r>
+            <w:r>
+              <w:rPr>
+                <w:b/>
+                <w:color w:val="FFFFFF"/>
+                <w:sz w:val="19"/>
+              </w:rPr>
+              <w:t>Телефон</w:t>
+            </w:r>
+          </w:p>
+        </w:tc>
+        <w:tc>
+          <w:tcPr>
+            <w:tcW w:type="dxa" w:w="3286"/>
+            <w:shd w:val="clear" w:fill="1F3864"/>
+          </w:tcPr>
+          <w:p>
+            <w:pPr>
+              <w:spacing w:after="40"/>
+            </w:pPr>
+            <w:r>
+              <w:rPr>
+                <w:b/>
+                <w:color w:val="FFFFFF"/>
+                <w:sz w:val="19"/>
+              </w:rPr>
+            </w:r>
+            <w:r>
+              <w:rPr>
+                <w:b/>
+                <w:color w:val="FFFFFF"/>
+                <w:sz w:val="19"/>
+              </w:rPr>
+              <w:t>Письмо</w:t>
+            </w:r>
+          </w:p>
+        </w:tc>
+      </w:tr>
+      <w:tr>
+        <w:tc>
+          <w:tcPr>
+            <w:tcW w:type="dxa" w:w="3286"/>
+          </w:tcPr>
+          <w:p>
+            <w:pPr>
+              <w:spacing w:after="40"/>
+            </w:pPr>
+            <w:r>
+              <w:rPr>
+                <w:sz w:val="19"/>
+              </w:rPr>
+            </w:r>
+            <w:r>
+              <w:rPr>
+                <w:sz w:val="19"/>
+              </w:rPr>
+              <w:t>Abercrombie &amp; Kent Egypt, Sun Boat III</w:t>
+            </w:r>
+          </w:p>
+        </w:tc>
+        <w:tc>
+          <w:tcPr>
+            <w:tcW w:type="dxa" w:w="3286"/>
+          </w:tcPr>
+          <w:p>
+            <w:pPr>
+              <w:spacing w:after="40"/>
+            </w:pPr>
+            <w:r>
+              <w:rPr>
+                <w:sz w:val="19"/>
+              </w:rPr>
+            </w:r>
+            <w:r>
+              <w:rPr>
+                <w:sz w:val="19"/>
+              </w:rPr>
+              <w:t>+20 2 2394 7701, +20 2 2394 7777</w:t>
+            </w:r>
+          </w:p>
+        </w:tc>
+        <w:tc>
+          <w:tcPr>
+            <w:tcW w:type="dxa" w:w="3286"/>
+          </w:tcPr>
+          <w:p>
+            <w:pPr>
+              <w:spacing w:after="40"/>
+            </w:pPr>
+            <w:r>
+              <w:rPr>
+                <w:sz w:val="19"/>
+              </w:rPr>
+            </w:r>
+            <w:r>
+              <w:rPr>
+                <w:sz w:val="19"/>
+              </w:rPr>
+              <w:t>01 и 02</w:t>
+            </w:r>
+          </w:p>
+        </w:tc>
+      </w:tr>
+      <w:tr>
+        <w:tc>
+          <w:tcPr>
+            <w:tcW w:type="dxa" w:w="3286"/>
+            <w:shd w:val="clear" w:fill="F2F5FA"/>
+          </w:tcPr>
+          <w:p>
+            <w:pPr>
+              <w:spacing w:after="40"/>
+            </w:pPr>
+            <w:r>
+              <w:rPr>
+                <w:sz w:val="19"/>
+              </w:rPr>
+            </w:r>
+            <w:r>
+              <w:rPr>
+                <w:sz w:val="19"/>
+              </w:rPr>
+              <w:t>Mandarin Oriental, Old Cataract</w:t>
+            </w:r>
+          </w:p>
+        </w:tc>
+        <w:tc>
+          <w:tcPr>
+            <w:tcW w:type="dxa" w:w="3286"/>
+            <w:shd w:val="clear" w:fill="F2F5FA"/>
+          </w:tcPr>
+          <w:p>
+            <w:pPr>
+              <w:spacing w:after="40"/>
+            </w:pPr>
+            <w:r>
+              <w:rPr>
+                <w:sz w:val="19"/>
+              </w:rPr>
+            </w:r>
+            <w:r>
+              <w:rPr>
+                <w:sz w:val="19"/>
+              </w:rPr>
+              <w:t>+20 102 222 9071, коммутатор +20 97 231 6000</w:t>
+            </w:r>
+          </w:p>
+        </w:tc>
+        <w:tc>
+          <w:tcPr>
+            <w:tcW w:type="dxa" w:w="3286"/>
+            <w:shd w:val="clear" w:fill="F2F5FA"/>
+          </w:tcPr>
+          <w:p>
+            <w:pPr>
+              <w:spacing w:after="40"/>
+            </w:pPr>
+            <w:r>
+              <w:rPr>
+                <w:sz w:val="19"/>
+              </w:rPr>
+            </w:r>
+            <w:r>
+              <w:rPr>
+                <w:sz w:val="19"/>
+              </w:rPr>
+              <w:t>05</w:t>
+            </w:r>
+          </w:p>
+        </w:tc>
+      </w:tr>
+      <w:tr>
+        <w:tc>
+          <w:tcPr>
+            <w:tcW w:type="dxa" w:w="3286"/>
+          </w:tcPr>
+          <w:p>
+            <w:pPr>
+              <w:spacing w:after="40"/>
+            </w:pPr>
+            <w:r>
+              <w:rPr>
+                <w:sz w:val="19"/>
+              </w:rPr>
+            </w:r>
+            <w:r>
+              <w:rPr>
+                <w:sz w:val="19"/>
+              </w:rPr>
+              <w:t>Hilton Luxor</w:t>
+            </w:r>
+          </w:p>
+        </w:tc>
+        <w:tc>
+          <w:tcPr>
+            <w:tcW w:type="dxa" w:w="3286"/>
+          </w:tcPr>
+          <w:p>
+            <w:pPr>
+              <w:spacing w:after="40"/>
+            </w:pPr>
+            <w:r>
+              <w:rPr>
+                <w:sz w:val="19"/>
+              </w:rPr>
+            </w:r>
+            <w:r>
+              <w:rPr>
+                <w:sz w:val="19"/>
+              </w:rPr>
+              <w:t>+20 95 239 9999</w:t>
+            </w:r>
+          </w:p>
+        </w:tc>
+        <w:tc>
+          <w:tcPr>
+            <w:tcW w:type="dxa" w:w="3286"/>
+          </w:tcPr>
+          <w:p>
+            <w:pPr>
+              <w:spacing w:after="40"/>
+            </w:pPr>
+            <w:r>
+              <w:rPr>
+                <w:sz w:val="19"/>
+              </w:rPr>
+            </w:r>
+            <w:r>
+              <w:rPr>
+                <w:sz w:val="19"/>
+              </w:rPr>
+              <w:t>07</w:t>
+            </w:r>
+          </w:p>
+        </w:tc>
+      </w:tr>
+    </w:tbl>
+    <w:p>
+      <w:pPr>
+        <w:spacing w:after="80"/>
+      </w:pPr>
+    </w:p>
+    <w:p>
+      <w:pPr>
+        <w:spacing w:before="240" w:after="80"/>
+      </w:pPr>
+      <w:r>
+        <w:rPr>
+          <w:b/>
+          <w:color w:val="1F3864"/>
+          <w:sz w:val="24"/>
+        </w:rPr>
+        <w:t>Только через форму на сайте</w:t>
+      </w:r>
+    </w:p>
+    <w:tbl>
+      <w:tblPr>
+        <w:tblStyle w:val="TableGrid"/>
+        <w:tblW w:type="auto" w:w="0"/>
+        <w:jc w:val="center"/>
+        <w:tblLook w:firstColumn="1" w:firstRow="1" w:lastColumn="0" w:lastRow="0" w:noHBand="0" w:noVBand="1" w:val="04A0"/>
+      </w:tblPr>
+      <w:tblGrid>
+        <w:gridCol w:w="3286"/>
+        <w:gridCol w:w="3286"/>
+        <w:gridCol w:w="3286"/>
+      </w:tblGrid>
+      <w:tr>
+        <w:tc>
+          <w:tcPr>
+            <w:tcW w:type="dxa" w:w="3286"/>
+            <w:shd w:val="clear" w:fill="1F3864"/>
+          </w:tcPr>
+          <w:p>
+            <w:pPr>
+              <w:spacing w:after="40"/>
+            </w:pPr>
+            <w:r>
+              <w:rPr>
+                <w:b/>
+                <w:color w:val="FFFFFF"/>
+                <w:sz w:val="19"/>
+              </w:rPr>
+            </w:r>
+            <w:r>
+              <w:rPr>
+                <w:b/>
+                <w:color w:val="FFFFFF"/>
+                <w:sz w:val="19"/>
+              </w:rPr>
+              <w:t>Кому</w:t>
+            </w:r>
+          </w:p>
+        </w:tc>
+        <w:tc>
+          <w:tcPr>
+            <w:tcW w:type="dxa" w:w="3286"/>
+            <w:shd w:val="clear" w:fill="1F3864"/>
+          </w:tcPr>
+          <w:p>
+            <w:pPr>
+              <w:spacing w:after="40"/>
+            </w:pPr>
+            <w:r>
+              <w:rPr>
+                <w:b/>
+                <w:color w:val="FFFFFF"/>
+                <w:sz w:val="19"/>
+              </w:rPr>
+            </w:r>
+            <w:r>
+              <w:rPr>
+                <w:b/>
+                <w:color w:val="FFFFFF"/>
+                <w:sz w:val="19"/>
+              </w:rPr>
+              <w:t>Страница</w:t>
+            </w:r>
+          </w:p>
+        </w:tc>
+        <w:tc>
+          <w:tcPr>
+            <w:tcW w:type="dxa" w:w="3286"/>
+            <w:shd w:val="clear" w:fill="1F3864"/>
+          </w:tcPr>
+          <w:p>
+            <w:pPr>
+              <w:spacing w:after="40"/>
+            </w:pPr>
+            <w:r>
+              <w:rPr>
+                <w:b/>
+                <w:color w:val="FFFFFF"/>
+                <w:sz w:val="19"/>
+              </w:rPr>
+            </w:r>
+            <w:r>
+              <w:rPr>
+                <w:b/>
+                <w:color w:val="FFFFFF"/>
+                <w:sz w:val="19"/>
+              </w:rPr>
+              <w:t>Письмо</w:t>
+            </w:r>
+          </w:p>
+        </w:tc>
+      </w:tr>
+      <w:tr>
+        <w:tc>
+          <w:tcPr>
+            <w:tcW w:type="dxa" w:w="3286"/>
+          </w:tcPr>
+          <w:p>
+            <w:pPr>
+              <w:spacing w:after="40"/>
+            </w:pPr>
+            <w:r>
+              <w:rPr>
+                <w:sz w:val="19"/>
+              </w:rPr>
+            </w:r>
+            <w:r>
+              <w:rPr>
+                <w:sz w:val="19"/>
+              </w:rPr>
+              <w:t>Discovery Tours Egypt</w:t>
+            </w:r>
+          </w:p>
+        </w:tc>
+        <w:tc>
+          <w:tcPr>
+            <w:tcW w:type="dxa" w:w="3286"/>
+          </w:tcPr>
+          <w:p>
+            <w:pPr>
+              <w:spacing w:after="40"/>
+            </w:pPr>
+            <w:r>
+              <w:rPr>
+                <w:sz w:val="19"/>
+              </w:rPr>
+            </w:r>
+            <w:r>
+              <w:rPr>
+                <w:sz w:val="19"/>
+              </w:rPr>
+              <w:t>dmcegypt.com</w:t>
+            </w:r>
+          </w:p>
+        </w:tc>
+        <w:tc>
+          <w:tcPr>
+            <w:tcW w:type="dxa" w:w="3286"/>
+          </w:tcPr>
+          <w:p>
+            <w:pPr>
+              <w:spacing w:after="40"/>
+            </w:pPr>
+            <w:r>
+              <w:rPr>
+                <w:sz w:val="19"/>
+              </w:rPr>
+            </w:r>
+            <w:r>
+              <w:rPr>
+                <w:sz w:val="19"/>
+              </w:rPr>
+              <w:t>02</w:t>
+            </w:r>
+          </w:p>
+        </w:tc>
+      </w:tr>
+      <w:tr>
+        <w:tc>
+          <w:tcPr>
+            <w:tcW w:type="dxa" w:w="3286"/>
+            <w:shd w:val="clear" w:fill="F2F5FA"/>
+          </w:tcPr>
+          <w:p>
+            <w:pPr>
+              <w:spacing w:after="40"/>
+            </w:pPr>
+            <w:r>
+              <w:rPr>
+                <w:sz w:val="19"/>
+              </w:rPr>
+            </w:r>
+            <w:r>
+              <w:rPr>
+                <w:sz w:val="19"/>
+              </w:rPr>
+              <w:t>Nour El Nil, дахабии</w:t>
+            </w:r>
+          </w:p>
+        </w:tc>
+        <w:tc>
+          <w:tcPr>
+            <w:tcW w:type="dxa" w:w="3286"/>
+            <w:shd w:val="clear" w:fill="F2F5FA"/>
+          </w:tcPr>
+          <w:p>
+            <w:pPr>
+              <w:spacing w:after="40"/>
+            </w:pPr>
+            <w:r>
+              <w:rPr>
+                <w:sz w:val="19"/>
+              </w:rPr>
+            </w:r>
+            <w:r>
+              <w:rPr>
+                <w:sz w:val="19"/>
+              </w:rPr>
+              <w:t>nourelnil.com/contact/</w:t>
+            </w:r>
+          </w:p>
+        </w:tc>
+        <w:tc>
+          <w:tcPr>
+            <w:tcW w:type="dxa" w:w="3286"/>
+            <w:shd w:val="clear" w:fill="F2F5FA"/>
+          </w:tcPr>
+          <w:p>
+            <w:pPr>
+              <w:spacing w:after="40"/>
+            </w:pPr>
+            <w:r>
+              <w:rPr>
+                <w:sz w:val="19"/>
+              </w:rPr>
+            </w:r>
+            <w:r>
+              <w:rPr>
+                <w:sz w:val="19"/>
+              </w:rPr>
+              <w:t>01</w:t>
+            </w:r>
+          </w:p>
+        </w:tc>
+      </w:tr>
+      <w:tr>
+        <w:tc>
+          <w:tcPr>
+            <w:tcW w:type="dxa" w:w="3286"/>
+          </w:tcPr>
+          <w:p>
+            <w:pPr>
+              <w:spacing w:after="40"/>
+            </w:pPr>
+            <w:r>
+              <w:rPr>
+                <w:sz w:val="19"/>
+              </w:rPr>
+            </w:r>
+            <w:r>
+              <w:rPr>
+                <w:sz w:val="19"/>
+              </w:rPr>
+              <w:t>Kemet Dahabiya</w:t>
+            </w:r>
+          </w:p>
+        </w:tc>
+        <w:tc>
+          <w:tcPr>
+            <w:tcW w:type="dxa" w:w="3286"/>
+          </w:tcPr>
+          <w:p>
+            <w:pPr>
+              <w:spacing w:after="40"/>
+            </w:pPr>
+            <w:r>
+              <w:rPr>
+                <w:sz w:val="19"/>
+              </w:rPr>
+            </w:r>
+            <w:r>
+              <w:rPr>
+                <w:sz w:val="19"/>
+              </w:rPr>
+              <w:t>kemetale.com, либо kemet.travel</w:t>
+            </w:r>
+          </w:p>
+        </w:tc>
+        <w:tc>
+          <w:tcPr>
+            <w:tcW w:type="dxa" w:w="3286"/>
+          </w:tcPr>
+          <w:p>
+            <w:pPr>
+              <w:spacing w:after="40"/>
+            </w:pPr>
+            <w:r>
+              <w:rPr>
+                <w:sz w:val="19"/>
+              </w:rPr>
+            </w:r>
+            <w:r>
+              <w:rPr>
+                <w:sz w:val="19"/>
+              </w:rPr>
+              <w:t>01</w:t>
+            </w:r>
+          </w:p>
+        </w:tc>
+      </w:tr>
+      <w:tr>
+        <w:tc>
+          <w:tcPr>
+            <w:tcW w:type="dxa" w:w="3286"/>
+            <w:shd w:val="clear" w:fill="F2F5FA"/>
+          </w:tcPr>
+          <w:p>
+            <w:pPr>
+              <w:spacing w:after="40"/>
+            </w:pPr>
+            <w:r>
+              <w:rPr>
+                <w:sz w:val="19"/>
+              </w:rPr>
+            </w:r>
+            <w:r>
+              <w:rPr>
+                <w:sz w:val="19"/>
+              </w:rPr>
+              <w:t>Hod Hod Soliman, шары</w:t>
+            </w:r>
+          </w:p>
+        </w:tc>
+        <w:tc>
+          <w:tcPr>
+            <w:tcW w:type="dxa" w:w="3286"/>
+            <w:shd w:val="clear" w:fill="F2F5FA"/>
+          </w:tcPr>
+          <w:p>
+            <w:pPr>
+              <w:spacing w:after="40"/>
+            </w:pPr>
+            <w:r>
+              <w:rPr>
+                <w:sz w:val="19"/>
+              </w:rPr>
+            </w:r>
+            <w:r>
+              <w:rPr>
+                <w:sz w:val="19"/>
+              </w:rPr>
+              <w:t>hodhodsolimanballoons.com/contact/</w:t>
+            </w:r>
+          </w:p>
+        </w:tc>
+        <w:tc>
+          <w:tcPr>
+            <w:tcW w:type="dxa" w:w="3286"/>
+            <w:shd w:val="clear" w:fill="F2F5FA"/>
+          </w:tcPr>
+          <w:p>
+            <w:pPr>
+              <w:spacing w:after="40"/>
+            </w:pPr>
+            <w:r>
+              <w:rPr>
+                <w:sz w:val="19"/>
+              </w:rPr>
+            </w:r>
+            <w:r>
+              <w:rPr>
+                <w:sz w:val="19"/>
+              </w:rPr>
+              <w:t>09</w:t>
+            </w:r>
+          </w:p>
+        </w:tc>
+      </w:tr>
+      <w:tr>
+        <w:tc>
+          <w:tcPr>
+            <w:tcW w:type="dxa" w:w="3286"/>
+          </w:tcPr>
+          <w:p>
+            <w:pPr>
+              <w:spacing w:after="40"/>
+            </w:pPr>
+            <w:r>
+              <w:rPr>
+                <w:sz w:val="19"/>
+              </w:rPr>
+            </w:r>
+            <w:r>
+              <w:rPr>
+                <w:sz w:val="19"/>
+              </w:rPr>
+              <w:t>Magic Horizon, шары</w:t>
+            </w:r>
+          </w:p>
+        </w:tc>
+        <w:tc>
+          <w:tcPr>
+            <w:tcW w:type="dxa" w:w="3286"/>
+          </w:tcPr>
+          <w:p>
+            <w:pPr>
+              <w:spacing w:after="40"/>
+            </w:pPr>
+            <w:r>
+              <w:rPr>
+                <w:sz w:val="19"/>
+              </w:rPr>
+            </w:r>
+            <w:r>
+              <w:rPr>
+                <w:sz w:val="19"/>
+              </w:rPr>
+              <w:t>visitluxorinhotairballoon.com/contact/</w:t>
+            </w:r>
+          </w:p>
+        </w:tc>
+        <w:tc>
+          <w:tcPr>
+            <w:tcW w:type="dxa" w:w="3286"/>
+          </w:tcPr>
+          <w:p>
+            <w:pPr>
+              <w:spacing w:after="40"/>
+            </w:pPr>
+            <w:r>
+              <w:rPr>
+                <w:sz w:val="19"/>
+              </w:rPr>
+            </w:r>
+            <w:r>
+              <w:rPr>
+                <w:sz w:val="19"/>
+              </w:rPr>
+              <w:t>09</w:t>
+            </w:r>
+          </w:p>
+        </w:tc>
+      </w:tr>
+    </w:tbl>
+    <w:p>
+      <w:pPr>
+        <w:spacing w:after="80"/>
+      </w:pPr>
+    </w:p>
+    <w:p>
+      <w:pPr>
+        <w:spacing w:before="240" w:after="80"/>
+      </w:pPr>
+      <w:r>
+        <w:rPr>
+          <w:b/>
+          <w:color w:val="1F3864"/>
+          <w:sz w:val="24"/>
+        </w:rPr>
+        <w:t>Две поправки к подбору</w:t>
+      </w:r>
+    </w:p>
+    <w:p>
+      <w:r>
+        <w:rPr>
+          <w:b/>
+        </w:rPr>
+        <w:t>Ovation Egypt это Emeco Travel.</w:t>
+      </w:r>
+      <w:r>
+        <w:t xml:space="preserve"> Ovation Global DMC представлена в Египте стратегическим партнёром Emeco Travel, и адрес каирского офиса у них тот же: 2 Talaat Harb Street, Downtown. </w:t>
+      </w:r>
+      <w:r>
+        <w:rPr>
+          <w:b/>
+        </w:rPr>
+        <w:t>[П]</w:t>
+      </w:r>
+      <w:r>
+        <w:t xml:space="preserve"> То есть писать и туда, и туда означает писать одной компании дважды. Шорт-лист принимающих компаний сокращается до трёх: </w:t>
+      </w:r>
+      <w:r>
+        <w:rPr>
+          <w:b/>
+        </w:rPr>
+        <w:t>Emeco, A&amp;K Egypt, Discovery Tours.</w:t>
+      </w:r>
+    </w:p>
+    <w:p>
+      <w:r>
+        <w:rPr>
+          <w:b/>
+        </w:rPr>
+        <w:t>Kemet Dahabiya берёт до 19 гостей</w:t>
+      </w:r>
+      <w:r>
+        <w:t xml:space="preserve"> и предлагается в полный чартер. </w:t>
+      </w:r>
+      <w:r>
+        <w:rPr>
+          <w:b/>
+        </w:rPr>
+        <w:t>[П]</w:t>
+      </w:r>
+      <w:r>
+        <w:t xml:space="preserve"> Это попадает в нужный диапазон по вместимости, в отличие от большинства дахабий. Но ограничение остаётся: дахабия, как правило, не идёт в темноте, значит риск шлюза не спрятать в ночь, и нужен вариант с посадкой в Эсне.</w:t>
+      </w:r>
+    </w:p>
     <w:sectPr>
       <w:pgSz w:w="12240" w:h="15840"/>
       <w:pgMar w:top="1134" w:right="1134" w:bottom="1134" w:left="1247" w:header="720" w:footer="720" w:gutter="0"/>

</xml_diff>

<commit_message>
Expand vessel shortlist and correct the Kemet entry
Corrects an error in the previous commit: Kemet was recorded as fitting
on a stated capacity of 19 guests, but it has 8 cabins, so single
occupancy caps it at 8. States the rule that applies to every candidate,
count cabins rather than guests, and lists the boats it excludes.

Adds Steam Ship Sudan as the strongest size match found: 18 cabins plus
5 suites over two decks, the restored 1885 steamer, with the caveat that
it books only through Voyageurs du Monde brands, so the first letter
must ask whether a full charter is sold to an independent agency at all.

Notes that the 18-25 cabin band is thinly populated by market structure,
which is why the shortlist stays short.

Co-Authored-By: Claude Opus 5 <noreply@anthropic.com>
Claude-Session: https://claude.ai/code/session_01KQFm1d6HbwvN6nT4uerjN3
</commit_message>
<xml_diff>
--- a/egypt-jan-2027/Подрядчики_кандидаты_и_проверка.docx
+++ b/egypt-jan-2027/Подрядчики_кандидаты_и_проверка.docx
@@ -3274,6 +3274,897 @@
         <w:t xml:space="preserve"> Это попадает в нужный диапазон по вместимости, в отличие от большинства дахабий. Но ограничение остаётся: дахабия, как правило, не идёт в темноте, значит риск шлюза не спрятать в ночь, и нужен вариант с посадкой в Эсне.</w:t>
       </w:r>
     </w:p>
+    <w:p>
+      <w:pPr>
+        <w:pBdr>
+          <w:bottom w:val="single" w:sz="6" w:space="1" w:color="BFBFBF"/>
+        </w:pBdr>
+        <w:spacing w:after="200"/>
+      </w:pPr>
+    </w:p>
+    <w:p>
+      <w:pPr>
+        <w:spacing w:before="320" w:after="120"/>
+      </w:pPr>
+      <w:r>
+        <w:rPr>
+          <w:b/>
+          <w:color w:val="1F3864"/>
+          <w:sz w:val="29"/>
+        </w:rPr>
+        <w:t>8. СУДА: РАСШИРЕННЫЙ ПОДБОР И ВАЖНАЯ ПОПРАВКА</w:t>
+      </w:r>
+    </w:p>
+    <w:p>
+      <w:pPr>
+        <w:spacing w:before="240" w:after="80"/>
+      </w:pPr>
+      <w:r>
+        <w:rPr>
+          <w:b/>
+          <w:color w:val="1F3864"/>
+          <w:sz w:val="24"/>
+        </w:rPr>
+        <w:t>Поправка к разделу 7: Kemet Dahabiya не подходит</w:t>
+      </w:r>
+    </w:p>
+    <w:p>
+      <w:r>
+        <w:t xml:space="preserve">Ранее я записала Kemet как подходящий борт на основании «до 19 гостей». Это ошибка в логике. У Kemet </w:t>
+      </w:r>
+      <w:r>
+        <w:rPr>
+          <w:b/>
+        </w:rPr>
+        <w:t>8 кают</w:t>
+      </w:r>
+      <w:r>
+        <w:t xml:space="preserve"> на 19 гостей, то есть вместимость достигается двухместным размещением. </w:t>
+      </w:r>
+      <w:r>
+        <w:rPr>
+          <w:b/>
+        </w:rPr>
+        <w:t>[П]</w:t>
+      </w:r>
+      <w:r>
+        <w:t xml:space="preserve"> При одноместном размещении это 8 гостей, а не 19.</w:t>
+      </w:r>
+    </w:p>
+    <w:p>
+      <w:r>
+        <w:rPr>
+          <w:b/>
+        </w:rPr>
+        <w:t>Правило, которое надо применять ко всем бортам: считаем каюты, а не гостей.</w:t>
+      </w:r>
+      <w:r>
+        <w:t xml:space="preserve"> Вам нужно до 20 кают. Вместимость «18 гостей» у дахабии почти всегда означает 8–9 кают.</w:t>
+      </w:r>
+    </w:p>
+    <w:p>
+      <w:r>
+        <w:t xml:space="preserve">Под это правило не проходят: Kemet (8 кают), Mövenpick SB Feddya (4 сюита), Sonesta Amirat (10–14 гостей), AD Nile Cruises (8 кают), The Nile Dahabiya (12 кают). </w:t>
+      </w:r>
+      <w:r>
+        <w:rPr>
+          <w:b/>
+        </w:rPr>
+        <w:t>[П]</w:t>
+      </w:r>
+    </w:p>
+    <w:p>
+      <w:pPr>
+        <w:spacing w:before="240" w:after="80"/>
+      </w:pPr>
+      <w:r>
+        <w:rPr>
+          <w:b/>
+          <w:color w:val="1F3864"/>
+          <w:sz w:val="24"/>
+        </w:rPr>
+        <w:t>Кто реально остаётся</w:t>
+      </w:r>
+    </w:p>
+    <w:p>
+      <w:r>
+        <w:t>Бортов нужного размера на рынке мало. Это не недоработка подбора, это структура рынка: суда делятся на камерные дахабии по 8–12 кают и большие круизёры по 40–60 кают, а диапазон 18–25 кают занимают единицы.</w:t>
+      </w:r>
+    </w:p>
+    <w:tbl>
+      <w:tblPr>
+        <w:tblStyle w:val="TableGrid"/>
+        <w:tblW w:type="auto" w:w="0"/>
+        <w:jc w:val="center"/>
+        <w:tblLook w:firstColumn="1" w:firstRow="1" w:lastColumn="0" w:lastRow="0" w:noHBand="0" w:noVBand="1" w:val="04A0"/>
+      </w:tblPr>
+      <w:tblGrid>
+        <w:gridCol w:w="2465"/>
+        <w:gridCol w:w="2465"/>
+        <w:gridCol w:w="2465"/>
+        <w:gridCol w:w="2465"/>
+      </w:tblGrid>
+      <w:tr>
+        <w:tc>
+          <w:tcPr>
+            <w:tcW w:type="dxa" w:w="2465"/>
+            <w:shd w:val="clear" w:fill="1F3864"/>
+          </w:tcPr>
+          <w:p>
+            <w:pPr>
+              <w:spacing w:after="40"/>
+            </w:pPr>
+            <w:r>
+              <w:rPr>
+                <w:b/>
+                <w:color w:val="FFFFFF"/>
+                <w:sz w:val="19"/>
+              </w:rPr>
+            </w:r>
+            <w:r>
+              <w:rPr>
+                <w:b/>
+                <w:color w:val="FFFFFF"/>
+                <w:sz w:val="19"/>
+              </w:rPr>
+              <w:t>Борт</w:t>
+            </w:r>
+          </w:p>
+        </w:tc>
+        <w:tc>
+          <w:tcPr>
+            <w:tcW w:type="dxa" w:w="2465"/>
+            <w:shd w:val="clear" w:fill="1F3864"/>
+          </w:tcPr>
+          <w:p>
+            <w:pPr>
+              <w:spacing w:after="40"/>
+            </w:pPr>
+            <w:r>
+              <w:rPr>
+                <w:b/>
+                <w:color w:val="FFFFFF"/>
+                <w:sz w:val="19"/>
+              </w:rPr>
+            </w:r>
+            <w:r>
+              <w:rPr>
+                <w:b/>
+                <w:color w:val="FFFFFF"/>
+                <w:sz w:val="19"/>
+              </w:rPr>
+              <w:t>Каюты</w:t>
+            </w:r>
+          </w:p>
+        </w:tc>
+        <w:tc>
+          <w:tcPr>
+            <w:tcW w:type="dxa" w:w="2465"/>
+            <w:shd w:val="clear" w:fill="1F3864"/>
+          </w:tcPr>
+          <w:p>
+            <w:pPr>
+              <w:spacing w:after="40"/>
+            </w:pPr>
+            <w:r>
+              <w:rPr>
+                <w:b/>
+                <w:color w:val="FFFFFF"/>
+                <w:sz w:val="19"/>
+              </w:rPr>
+            </w:r>
+            <w:r>
+              <w:rPr>
+                <w:b/>
+                <w:color w:val="FFFFFF"/>
+                <w:sz w:val="19"/>
+              </w:rPr>
+              <w:t>Контакт</w:t>
+            </w:r>
+          </w:p>
+        </w:tc>
+        <w:tc>
+          <w:tcPr>
+            <w:tcW w:type="dxa" w:w="2465"/>
+            <w:shd w:val="clear" w:fill="1F3864"/>
+          </w:tcPr>
+          <w:p>
+            <w:pPr>
+              <w:spacing w:after="40"/>
+            </w:pPr>
+            <w:r>
+              <w:rPr>
+                <w:b/>
+                <w:color w:val="FFFFFF"/>
+                <w:sz w:val="19"/>
+              </w:rPr>
+            </w:r>
+            <w:r>
+              <w:rPr>
+                <w:b/>
+                <w:color w:val="FFFFFF"/>
+                <w:sz w:val="19"/>
+              </w:rPr>
+              <w:t>Примечание</w:t>
+            </w:r>
+          </w:p>
+        </w:tc>
+      </w:tr>
+      <w:tr>
+        <w:tc>
+          <w:tcPr>
+            <w:tcW w:type="dxa" w:w="2465"/>
+          </w:tcPr>
+          <w:p>
+            <w:pPr>
+              <w:spacing w:after="40"/>
+            </w:pPr>
+            <w:r>
+              <w:rPr>
+                <w:sz w:val="19"/>
+              </w:rPr>
+            </w:r>
+            <w:r>
+              <w:rPr>
+                <w:b/>
+                <w:sz w:val="19"/>
+              </w:rPr>
+              <w:t>Oberoi Philae</w:t>
+            </w:r>
+          </w:p>
+        </w:tc>
+        <w:tc>
+          <w:tcPr>
+            <w:tcW w:type="dxa" w:w="2465"/>
+          </w:tcPr>
+          <w:p>
+            <w:pPr>
+              <w:spacing w:after="40"/>
+            </w:pPr>
+            <w:r>
+              <w:rPr>
+                <w:sz w:val="19"/>
+              </w:rPr>
+            </w:r>
+            <w:r>
+              <w:rPr>
+                <w:sz w:val="19"/>
+              </w:rPr>
+              <w:t xml:space="preserve">18–22, уточнить </w:t>
+            </w:r>
+            <w:r>
+              <w:rPr>
+                <w:b/>
+                <w:sz w:val="19"/>
+              </w:rPr>
+              <w:t>[Н]</w:t>
+            </w:r>
+          </w:p>
+        </w:tc>
+        <w:tc>
+          <w:tcPr>
+            <w:tcW w:type="dxa" w:w="2465"/>
+          </w:tcPr>
+          <w:p>
+            <w:pPr>
+              <w:spacing w:after="40"/>
+            </w:pPr>
+            <w:r>
+              <w:rPr>
+                <w:sz w:val="19"/>
+              </w:rPr>
+            </w:r>
+            <w:r>
+              <w:rPr>
+                <w:rFonts w:ascii="Consolas" w:hAnsi="Consolas"/>
+                <w:sz w:val="19"/>
+              </w:rPr>
+              <w:t>reservations@oberoigroup.com</w:t>
+            </w:r>
+          </w:p>
+        </w:tc>
+        <w:tc>
+          <w:tcPr>
+            <w:tcW w:type="dxa" w:w="2465"/>
+          </w:tcPr>
+          <w:p>
+            <w:pPr>
+              <w:spacing w:after="40"/>
+            </w:pPr>
+            <w:r>
+              <w:rPr>
+                <w:sz w:val="19"/>
+              </w:rPr>
+            </w:r>
+            <w:r>
+              <w:rPr>
+                <w:sz w:val="19"/>
+              </w:rPr>
+              <w:t>Источники расходятся: 18 и 22. Запросить схему палуб</w:t>
+            </w:r>
+          </w:p>
+        </w:tc>
+      </w:tr>
+      <w:tr>
+        <w:tc>
+          <w:tcPr>
+            <w:tcW w:type="dxa" w:w="2465"/>
+            <w:shd w:val="clear" w:fill="F2F5FA"/>
+          </w:tcPr>
+          <w:p>
+            <w:pPr>
+              <w:spacing w:after="40"/>
+            </w:pPr>
+            <w:r>
+              <w:rPr>
+                <w:sz w:val="19"/>
+              </w:rPr>
+            </w:r>
+            <w:r>
+              <w:rPr>
+                <w:b/>
+                <w:sz w:val="19"/>
+              </w:rPr>
+              <w:t>Oberoi Zahra</w:t>
+            </w:r>
+          </w:p>
+        </w:tc>
+        <w:tc>
+          <w:tcPr>
+            <w:tcW w:type="dxa" w:w="2465"/>
+            <w:shd w:val="clear" w:fill="F2F5FA"/>
+          </w:tcPr>
+          <w:p>
+            <w:pPr>
+              <w:spacing w:after="40"/>
+            </w:pPr>
+            <w:r>
+              <w:rPr>
+                <w:sz w:val="19"/>
+              </w:rPr>
+            </w:r>
+            <w:r>
+              <w:rPr>
+                <w:sz w:val="19"/>
+              </w:rPr>
+              <w:t xml:space="preserve">~25 </w:t>
+            </w:r>
+            <w:r>
+              <w:rPr>
+                <w:b/>
+                <w:sz w:val="19"/>
+              </w:rPr>
+              <w:t>[Н]</w:t>
+            </w:r>
+          </w:p>
+        </w:tc>
+        <w:tc>
+          <w:tcPr>
+            <w:tcW w:type="dxa" w:w="2465"/>
+            <w:shd w:val="clear" w:fill="F2F5FA"/>
+          </w:tcPr>
+          <w:p>
+            <w:pPr>
+              <w:spacing w:after="40"/>
+            </w:pPr>
+            <w:r>
+              <w:rPr>
+                <w:sz w:val="19"/>
+              </w:rPr>
+            </w:r>
+            <w:r>
+              <w:rPr>
+                <w:sz w:val="19"/>
+              </w:rPr>
+              <w:t>тот же адрес</w:t>
+            </w:r>
+          </w:p>
+        </w:tc>
+        <w:tc>
+          <w:tcPr>
+            <w:tcW w:type="dxa" w:w="2465"/>
+            <w:shd w:val="clear" w:fill="F2F5FA"/>
+          </w:tcPr>
+          <w:p>
+            <w:pPr>
+              <w:spacing w:after="40"/>
+            </w:pPr>
+            <w:r>
+              <w:rPr>
+                <w:sz w:val="19"/>
+              </w:rPr>
+            </w:r>
+            <w:r>
+              <w:rPr>
+                <w:sz w:val="19"/>
+              </w:rPr>
+              <w:t>Чуть велик, но проходит</w:t>
+            </w:r>
+          </w:p>
+        </w:tc>
+      </w:tr>
+      <w:tr>
+        <w:tc>
+          <w:tcPr>
+            <w:tcW w:type="dxa" w:w="2465"/>
+          </w:tcPr>
+          <w:p>
+            <w:pPr>
+              <w:spacing w:after="40"/>
+            </w:pPr>
+            <w:r>
+              <w:rPr>
+                <w:sz w:val="19"/>
+              </w:rPr>
+            </w:r>
+            <w:r>
+              <w:rPr>
+                <w:b/>
+                <w:sz w:val="19"/>
+              </w:rPr>
+              <w:t>Steam Ship Sudan</w:t>
+            </w:r>
+          </w:p>
+        </w:tc>
+        <w:tc>
+          <w:tcPr>
+            <w:tcW w:type="dxa" w:w="2465"/>
+          </w:tcPr>
+          <w:p>
+            <w:pPr>
+              <w:spacing w:after="40"/>
+            </w:pPr>
+            <w:r>
+              <w:rPr>
+                <w:sz w:val="19"/>
+              </w:rPr>
+            </w:r>
+            <w:r>
+              <w:rPr>
+                <w:b/>
+                <w:sz w:val="19"/>
+              </w:rPr>
+              <w:t>18 каюt плюс 5 сюитов, два уровня [П]</w:t>
+            </w:r>
+          </w:p>
+        </w:tc>
+        <w:tc>
+          <w:tcPr>
+            <w:tcW w:type="dxa" w:w="2465"/>
+          </w:tcPr>
+          <w:p>
+            <w:pPr>
+              <w:spacing w:after="40"/>
+            </w:pPr>
+            <w:r>
+              <w:rPr>
+                <w:sz w:val="19"/>
+              </w:rPr>
+            </w:r>
+            <w:r>
+              <w:rPr>
+                <w:sz w:val="19"/>
+              </w:rPr>
+              <w:t>steam-ship-sudan.com/en/contact-2/. Бронирование через Original Travel, группа Voyageurs du Monde</w:t>
+            </w:r>
+          </w:p>
+        </w:tc>
+        <w:tc>
+          <w:tcPr>
+            <w:tcW w:type="dxa" w:w="2465"/>
+          </w:tcPr>
+          <w:p>
+            <w:pPr>
+              <w:spacing w:after="40"/>
+            </w:pPr>
+            <w:r>
+              <w:rPr>
+                <w:sz w:val="19"/>
+              </w:rPr>
+            </w:r>
+            <w:r>
+              <w:rPr>
+                <w:sz w:val="19"/>
+              </w:rPr>
+              <w:t>Исторический паровой пароход 1885 года, связан с Агатой Кристи. По размеру и характеру лучший кандидат из найденных</w:t>
+            </w:r>
+          </w:p>
+        </w:tc>
+      </w:tr>
+      <w:tr>
+        <w:tc>
+          <w:tcPr>
+            <w:tcW w:type="dxa" w:w="2465"/>
+            <w:shd w:val="clear" w:fill="F2F5FA"/>
+          </w:tcPr>
+          <w:p>
+            <w:pPr>
+              <w:spacing w:after="40"/>
+            </w:pPr>
+            <w:r>
+              <w:rPr>
+                <w:sz w:val="19"/>
+              </w:rPr>
+            </w:r>
+            <w:r>
+              <w:rPr>
+                <w:b/>
+                <w:sz w:val="19"/>
+              </w:rPr>
+              <w:t>Sanctuary Sun Boat III</w:t>
+            </w:r>
+          </w:p>
+        </w:tc>
+        <w:tc>
+          <w:tcPr>
+            <w:tcW w:type="dxa" w:w="2465"/>
+            <w:shd w:val="clear" w:fill="F2F5FA"/>
+          </w:tcPr>
+          <w:p>
+            <w:pPr>
+              <w:spacing w:after="40"/>
+            </w:pPr>
+            <w:r>
+              <w:rPr>
+                <w:sz w:val="19"/>
+              </w:rPr>
+            </w:r>
+            <w:r>
+              <w:rPr>
+                <w:sz w:val="19"/>
+              </w:rPr>
+              <w:t xml:space="preserve">16 </w:t>
+            </w:r>
+            <w:r>
+              <w:rPr>
+                <w:b/>
+                <w:sz w:val="19"/>
+              </w:rPr>
+              <w:t>[П]</w:t>
+            </w:r>
+          </w:p>
+        </w:tc>
+        <w:tc>
+          <w:tcPr>
+            <w:tcW w:type="dxa" w:w="2465"/>
+            <w:shd w:val="clear" w:fill="F2F5FA"/>
+          </w:tcPr>
+          <w:p>
+            <w:pPr>
+              <w:spacing w:after="40"/>
+            </w:pPr>
+            <w:r>
+              <w:rPr>
+                <w:sz w:val="19"/>
+              </w:rPr>
+            </w:r>
+            <w:r>
+              <w:rPr>
+                <w:sz w:val="19"/>
+              </w:rPr>
+              <w:t>A&amp;K Egypt, +20 2 2394 7701, +20 2 2394 7777</w:t>
+            </w:r>
+          </w:p>
+        </w:tc>
+        <w:tc>
+          <w:tcPr>
+            <w:tcW w:type="dxa" w:w="2465"/>
+            <w:shd w:val="clear" w:fill="F2F5FA"/>
+          </w:tcPr>
+          <w:p>
+            <w:pPr>
+              <w:spacing w:after="40"/>
+            </w:pPr>
+            <w:r>
+              <w:rPr>
+                <w:sz w:val="19"/>
+              </w:rPr>
+            </w:r>
+            <w:r>
+              <w:rPr>
+                <w:sz w:val="19"/>
+              </w:rPr>
+              <w:t>Кают в обрез, подходит при 14 гостях в single</w:t>
+            </w:r>
+          </w:p>
+        </w:tc>
+      </w:tr>
+      <w:tr>
+        <w:tc>
+          <w:tcPr>
+            <w:tcW w:type="dxa" w:w="2465"/>
+          </w:tcPr>
+          <w:p>
+            <w:pPr>
+              <w:spacing w:after="40"/>
+            </w:pPr>
+            <w:r>
+              <w:rPr>
+                <w:sz w:val="19"/>
+              </w:rPr>
+            </w:r>
+            <w:r>
+              <w:rPr>
+                <w:strike/>
+                <w:sz w:val="19"/>
+              </w:rPr>
+              <w:t>Historia Boutique</w:t>
+            </w:r>
+          </w:p>
+        </w:tc>
+        <w:tc>
+          <w:tcPr>
+            <w:tcW w:type="dxa" w:w="2465"/>
+          </w:tcPr>
+          <w:p>
+            <w:pPr>
+              <w:spacing w:after="40"/>
+            </w:pPr>
+            <w:r>
+              <w:rPr>
+                <w:sz w:val="19"/>
+              </w:rPr>
+            </w:r>
+            <w:r>
+              <w:rPr>
+                <w:sz w:val="19"/>
+              </w:rPr>
+              <w:t xml:space="preserve">34 каюты плюс 12 сюитов </w:t>
+            </w:r>
+            <w:r>
+              <w:rPr>
+                <w:b/>
+                <w:sz w:val="19"/>
+              </w:rPr>
+              <w:t>[П]</w:t>
+            </w:r>
+          </w:p>
+        </w:tc>
+        <w:tc>
+          <w:tcPr>
+            <w:tcW w:type="dxa" w:w="2465"/>
+          </w:tcPr>
+          <w:p>
+            <w:pPr>
+              <w:spacing w:after="40"/>
+            </w:pPr>
+            <w:r>
+              <w:rPr>
+                <w:sz w:val="19"/>
+              </w:rPr>
+            </w:r>
+            <w:r>
+              <w:rPr>
+                <w:sz w:val="19"/>
+              </w:rPr>
+              <w:t>—</w:t>
+            </w:r>
+          </w:p>
+        </w:tc>
+        <w:tc>
+          <w:tcPr>
+            <w:tcW w:type="dxa" w:w="2465"/>
+          </w:tcPr>
+          <w:p>
+            <w:pPr>
+              <w:spacing w:after="40"/>
+            </w:pPr>
+            <w:r>
+              <w:rPr>
+                <w:sz w:val="19"/>
+              </w:rPr>
+            </w:r>
+            <w:r>
+              <w:rPr>
+                <w:sz w:val="19"/>
+              </w:rPr>
+              <w:t>Исключено, 46 номеров</w:t>
+            </w:r>
+          </w:p>
+        </w:tc>
+      </w:tr>
+      <w:tr>
+        <w:tc>
+          <w:tcPr>
+            <w:tcW w:type="dxa" w:w="2465"/>
+            <w:shd w:val="clear" w:fill="F2F5FA"/>
+          </w:tcPr>
+          <w:p>
+            <w:pPr>
+              <w:spacing w:after="40"/>
+            </w:pPr>
+            <w:r>
+              <w:rPr>
+                <w:sz w:val="19"/>
+              </w:rPr>
+            </w:r>
+            <w:r>
+              <w:rPr>
+                <w:strike/>
+                <w:sz w:val="19"/>
+              </w:rPr>
+              <w:t>Soleil</w:t>
+            </w:r>
+            <w:r>
+              <w:rPr>
+                <w:sz w:val="19"/>
+              </w:rPr>
+              <w:t xml:space="preserve">, </w:t>
+            </w:r>
+            <w:r>
+              <w:rPr>
+                <w:strike/>
+                <w:sz w:val="19"/>
+              </w:rPr>
+              <w:t>Farah</w:t>
+            </w:r>
+          </w:p>
+        </w:tc>
+        <w:tc>
+          <w:tcPr>
+            <w:tcW w:type="dxa" w:w="2465"/>
+            <w:shd w:val="clear" w:fill="F2F5FA"/>
+          </w:tcPr>
+          <w:p>
+            <w:pPr>
+              <w:spacing w:after="40"/>
+            </w:pPr>
+            <w:r>
+              <w:rPr>
+                <w:sz w:val="19"/>
+              </w:rPr>
+            </w:r>
+            <w:r>
+              <w:rPr>
+                <w:sz w:val="19"/>
+              </w:rPr>
+              <w:t xml:space="preserve">53 и 55–62 </w:t>
+            </w:r>
+            <w:r>
+              <w:rPr>
+                <w:b/>
+                <w:sz w:val="19"/>
+              </w:rPr>
+              <w:t>[П]</w:t>
+            </w:r>
+          </w:p>
+        </w:tc>
+        <w:tc>
+          <w:tcPr>
+            <w:tcW w:type="dxa" w:w="2465"/>
+            <w:shd w:val="clear" w:fill="F2F5FA"/>
+          </w:tcPr>
+          <w:p>
+            <w:pPr>
+              <w:spacing w:after="40"/>
+            </w:pPr>
+            <w:r>
+              <w:rPr>
+                <w:sz w:val="19"/>
+              </w:rPr>
+            </w:r>
+            <w:r>
+              <w:rPr>
+                <w:sz w:val="19"/>
+              </w:rPr>
+              <w:t>—</w:t>
+            </w:r>
+          </w:p>
+        </w:tc>
+        <w:tc>
+          <w:tcPr>
+            <w:tcW w:type="dxa" w:w="2465"/>
+            <w:shd w:val="clear" w:fill="F2F5FA"/>
+          </w:tcPr>
+          <w:p>
+            <w:pPr>
+              <w:spacing w:after="40"/>
+            </w:pPr>
+            <w:r>
+              <w:rPr>
+                <w:sz w:val="19"/>
+              </w:rPr>
+            </w:r>
+            <w:r>
+              <w:rPr>
+                <w:sz w:val="19"/>
+              </w:rPr>
+              <w:t>Исключено</w:t>
+            </w:r>
+          </w:p>
+        </w:tc>
+      </w:tr>
+    </w:tbl>
+    <w:p>
+      <w:pPr>
+        <w:spacing w:after="80"/>
+      </w:pPr>
+    </w:p>
+    <w:p>
+      <w:pPr>
+        <w:spacing w:before="240" w:after="80"/>
+      </w:pPr>
+      <w:r>
+        <w:rPr>
+          <w:b/>
+          <w:color w:val="1F3864"/>
+          <w:sz w:val="24"/>
+        </w:rPr>
+        <w:t>Почему Steam Ship Sudan стоит запросить в приоритете</w:t>
+      </w:r>
+    </w:p>
+    <w:p>
+      <w:pPr>
+        <w:pStyle w:val="ListBullet"/>
+        <w:spacing w:after="60"/>
+      </w:pPr>
+      <w:r>
+        <w:t xml:space="preserve">Размер точно ваш: 23 номера на два уровня, то есть 16 гостей в single плюс штаб размещаются без компромиссов. </w:t>
+      </w:r>
+      <w:r>
+        <w:rPr>
+          <w:b/>
+        </w:rPr>
+        <w:t>[П]</w:t>
+      </w:r>
+    </w:p>
+    <w:p>
+      <w:pPr>
+        <w:pStyle w:val="ListBullet"/>
+        <w:spacing w:after="60"/>
+      </w:pPr>
+      <w:r>
+        <w:t>Исторический пароход с салонами и библиотекой, а не переделанный под круиз отель. Для рабочих сессий это лучше, чем лаунж-бар современного борта.</w:t>
+      </w:r>
+    </w:p>
+    <w:p>
+      <w:pPr>
+        <w:pStyle w:val="ListBullet"/>
+        <w:spacing w:after="60"/>
+      </w:pPr>
+      <w:r>
+        <w:t>Тематически сходится с финалом в Old Cataract: и пароход, и отель связаны с «Смертью на Ниле».</w:t>
+      </w:r>
+    </w:p>
+    <w:p>
+      <w:pPr>
+        <w:pStyle w:val="ListBullet"/>
+        <w:spacing w:after="60"/>
+      </w:pPr>
+      <w:r>
+        <w:t>Ограничение: бронируется только через Voyageurs du Monde и их бренды, то есть вы работаете через посредника, а не напрямую с оператором. Это надо проверить в первом же письме: продают ли они полный фрахт сторонней компании, или только в составе своего пакета.</w:t>
+      </w:r>
+    </w:p>
+    <w:p>
+      <w:pPr>
+        <w:spacing w:before="240" w:after="80"/>
+      </w:pPr>
+      <w:r>
+        <w:rPr>
+          <w:b/>
+          <w:color w:val="1F3864"/>
+          <w:sz w:val="24"/>
+        </w:rPr>
+        <w:t>Что писать дополнительно</w:t>
+      </w:r>
+    </w:p>
+    <w:p>
+      <w:r>
+        <w:t>Письмо 01 без изменений, просто отправьте его ещё по трём адресам: steam-ship-sudan.com/en/contact-2/, nourelnil.com/contact/ для сравнения по дахабиям, и в A&amp;K по телефону.</w:t>
+      </w:r>
+    </w:p>
+    <w:p>
+      <w:r>
+        <w:t xml:space="preserve">Для Steam Ship Sudan добавьте в письмо один вопрос: </w:t>
+      </w:r>
+      <w:r>
+        <w:rPr>
+          <w:rFonts w:ascii="Consolas" w:hAnsi="Consolas"/>
+          <w:sz w:val="19"/>
+        </w:rPr>
+        <w:t>Do you sell a full charter of the vessel to an independent agency, or only as part of your own packages? If the latter, what is the minimum we must purchase through you?</w:t>
+      </w:r>
+    </w:p>
     <w:sectPr>
       <w:pgSz w:w="12240" w:h="15840"/>
       <w:pgMar w:top="1134" w:right="1134" w:bottom="1134" w:left="1247" w:header="720" w:footer="720" w:gutter="0"/>

</xml_diff>